<commit_message>
Update test report and Keil settings
</commit_message>
<xml_diff>
--- a/Test_Case_Report.docx
+++ b/Test_Case_Report.docx
@@ -1398,6 +1398,9 @@
     </w:p>
     <w:p>
       <w:r>
+        <w:rPr>
+          <w:noProof/>
+        </w:rPr>
         <w:lastRenderedPageBreak/>
         <w:drawing>
           <wp:inline distT="0" distB="0" distL="0" distR="0" wp14:anchorId="15254105" wp14:editId="50A83534">
@@ -1438,6 +1441,9 @@
     </w:p>
     <w:p>
       <w:r>
+        <w:rPr>
+          <w:noProof/>
+        </w:rPr>
         <w:drawing>
           <wp:inline distT="0" distB="0" distL="0" distR="0" wp14:anchorId="79E92B19" wp14:editId="379C9718">
             <wp:extent cx="5972810" cy="2388870"/>
@@ -1788,6 +1794,9 @@
     </w:p>
     <w:p>
       <w:r>
+        <w:rPr>
+          <w:noProof/>
+        </w:rPr>
         <w:lastRenderedPageBreak/>
         <w:drawing>
           <wp:inline distT="0" distB="0" distL="0" distR="0" wp14:anchorId="4698E020" wp14:editId="5C11D235">
@@ -1829,6 +1838,9 @@
     <w:p/>
     <w:p>
       <w:r>
+        <w:rPr>
+          <w:noProof/>
+        </w:rPr>
         <w:drawing>
           <wp:inline distT="0" distB="0" distL="0" distR="0" wp14:anchorId="07EB31BA" wp14:editId="5580ACE6">
             <wp:extent cx="5972810" cy="1891665"/>
@@ -2172,6 +2184,7 @@
     <w:p>
       <w:r>
         <w:rPr>
+          <w:noProof/>
           <w:color w:val="404040"/>
           <w:sz w:val="20"/>
         </w:rPr>
@@ -2526,6 +2539,9 @@
     </w:p>
     <w:p>
       <w:r>
+        <w:rPr>
+          <w:noProof/>
+        </w:rPr>
         <w:drawing>
           <wp:inline distT="0" distB="0" distL="0" distR="0" wp14:anchorId="569F4BEC" wp14:editId="3BB535A5">
             <wp:extent cx="5972810" cy="2138680"/>
@@ -2880,6 +2896,9 @@
     </w:p>
     <w:p>
       <w:r>
+        <w:rPr>
+          <w:noProof/>
+        </w:rPr>
         <w:drawing>
           <wp:inline distT="0" distB="0" distL="0" distR="0" wp14:anchorId="36906E77" wp14:editId="7A6F6B97">
             <wp:extent cx="5972810" cy="2152015"/>
@@ -3256,6 +3275,9 @@
     </w:p>
     <w:p>
       <w:r>
+        <w:rPr>
+          <w:noProof/>
+        </w:rPr>
         <w:drawing>
           <wp:inline distT="0" distB="0" distL="0" distR="0" wp14:anchorId="38EAFBDD" wp14:editId="6194EB78">
             <wp:extent cx="5972810" cy="2524760"/>
@@ -3615,6 +3637,9 @@
     </w:p>
     <w:p>
       <w:r>
+        <w:rPr>
+          <w:noProof/>
+        </w:rPr>
         <w:drawing>
           <wp:inline distT="0" distB="0" distL="0" distR="0" wp14:anchorId="3B581BB2" wp14:editId="49F985E3">
             <wp:extent cx="5972810" cy="2647315"/>
@@ -3966,6 +3991,7 @@
     <w:p>
       <w:r>
         <w:rPr>
+          <w:noProof/>
           <w:color w:val="404040"/>
           <w:sz w:val="20"/>
         </w:rPr>
@@ -4319,6 +4345,9 @@
     </w:p>
     <w:p>
       <w:r>
+        <w:rPr>
+          <w:noProof/>
+        </w:rPr>
         <w:drawing>
           <wp:inline distT="0" distB="0" distL="0" distR="0" wp14:anchorId="2DE7BDCB" wp14:editId="5BE701FF">
             <wp:extent cx="5972810" cy="2426335"/>
@@ -4660,6 +4689,9 @@
     </w:p>
     <w:p>
       <w:r>
+        <w:rPr>
+          <w:noProof/>
+        </w:rPr>
         <w:lastRenderedPageBreak/>
         <w:drawing>
           <wp:inline distT="0" distB="0" distL="0" distR="0" wp14:anchorId="66811C7D" wp14:editId="6AA645FE">
@@ -4700,6 +4732,9 @@
     </w:p>
     <w:p>
       <w:r>
+        <w:rPr>
+          <w:noProof/>
+        </w:rPr>
         <w:drawing>
           <wp:inline distT="0" distB="0" distL="0" distR="0" wp14:anchorId="558FF7C8" wp14:editId="2D337AF6">
             <wp:extent cx="5972810" cy="2256155"/>
@@ -5042,6 +5077,7 @@
     <w:p>
       <w:r>
         <w:rPr>
+          <w:noProof/>
           <w:color w:val="404040"/>
           <w:sz w:val="20"/>
         </w:rPr>
@@ -5085,6 +5121,9 @@
     </w:p>
     <w:p>
       <w:r>
+        <w:rPr>
+          <w:noProof/>
+        </w:rPr>
         <w:drawing>
           <wp:inline distT="0" distB="0" distL="0" distR="0" wp14:anchorId="60E10403" wp14:editId="0235F5F4">
             <wp:extent cx="5972810" cy="2045970"/>
@@ -5432,6 +5471,7 @@
     <w:p>
       <w:r>
         <w:rPr>
+          <w:noProof/>
           <w:color w:val="404040"/>
           <w:sz w:val="20"/>
         </w:rPr>
@@ -5790,6 +5830,9 @@
     </w:p>
     <w:p>
       <w:r>
+        <w:rPr>
+          <w:noProof/>
+        </w:rPr>
         <w:lastRenderedPageBreak/>
         <w:drawing>
           <wp:inline distT="0" distB="0" distL="0" distR="0" wp14:anchorId="629363E4" wp14:editId="705E8258">
@@ -6141,6 +6184,7 @@
     <w:p>
       <w:r>
         <w:rPr>
+          <w:noProof/>
           <w:color w:val="404040"/>
           <w:sz w:val="20"/>
         </w:rPr>
@@ -6481,6 +6525,9 @@
     </w:p>
     <w:p>
       <w:r>
+        <w:rPr>
+          <w:noProof/>
+        </w:rPr>
         <w:drawing>
           <wp:inline distT="0" distB="0" distL="0" distR="0" wp14:anchorId="53FFD62B" wp14:editId="07D87594">
             <wp:extent cx="5972810" cy="2643505"/>
@@ -6829,6 +6876,7 @@
     <w:p>
       <w:r>
         <w:rPr>
+          <w:noProof/>
           <w:color w:val="404040"/>
           <w:sz w:val="20"/>
         </w:rPr>
@@ -7174,6 +7222,7 @@
     <w:p>
       <w:r>
         <w:rPr>
+          <w:noProof/>
           <w:color w:val="404040"/>
           <w:sz w:val="20"/>
         </w:rPr>
@@ -7530,6 +7579,7 @@
     <w:p>
       <w:r>
         <w:rPr>
+          <w:noProof/>
           <w:color w:val="404040"/>
           <w:sz w:val="20"/>
         </w:rPr>
@@ -7881,8 +7931,85 @@
         <w:t>Screenshot:</w:t>
       </w:r>
     </w:p>
-    <w:p/>
-    <w:p/>
+    <w:p>
+      <w:r>
+        <w:lastRenderedPageBreak/>
+        <w:drawing>
+          <wp:inline distT="0" distB="0" distL="0" distR="0" wp14:anchorId="0106AE3F" wp14:editId="44ABDDBC">
+            <wp:extent cx="5972810" cy="2776855"/>
+            <wp:effectExtent l="0" t="0" r="8890" b="4445"/>
+            <wp:docPr id="2063076231" name="Picture 1"/>
+            <wp:cNvGraphicFramePr>
+              <a:graphicFrameLocks xmlns:a="http://schemas.openxmlformats.org/drawingml/2006/main" noChangeAspect="1"/>
+            </wp:cNvGraphicFramePr>
+            <a:graphic xmlns:a="http://schemas.openxmlformats.org/drawingml/2006/main">
+              <a:graphicData uri="http://schemas.openxmlformats.org/drawingml/2006/picture">
+                <pic:pic xmlns:pic="http://schemas.openxmlformats.org/drawingml/2006/picture">
+                  <pic:nvPicPr>
+                    <pic:cNvPr id="2063076231" name=""/>
+                    <pic:cNvPicPr/>
+                  </pic:nvPicPr>
+                  <pic:blipFill>
+                    <a:blip r:embed="rId28"/>
+                    <a:stretch>
+                      <a:fillRect/>
+                    </a:stretch>
+                  </pic:blipFill>
+                  <pic:spPr>
+                    <a:xfrm>
+                      <a:off x="0" y="0"/>
+                      <a:ext cx="5972810" cy="2776855"/>
+                    </a:xfrm>
+                    <a:prstGeom prst="rect">
+                      <a:avLst/>
+                    </a:prstGeom>
+                  </pic:spPr>
+                </pic:pic>
+              </a:graphicData>
+            </a:graphic>
+          </wp:inline>
+        </w:drawing>
+      </w:r>
+    </w:p>
+    <w:p>
+      <w:r>
+        <w:drawing>
+          <wp:inline distT="0" distB="0" distL="0" distR="0" wp14:anchorId="0F48AE6F" wp14:editId="55508E17">
+            <wp:extent cx="5972810" cy="2179955"/>
+            <wp:effectExtent l="0" t="0" r="8890" b="0"/>
+            <wp:docPr id="133078614" name="Picture 1"/>
+            <wp:cNvGraphicFramePr>
+              <a:graphicFrameLocks xmlns:a="http://schemas.openxmlformats.org/drawingml/2006/main" noChangeAspect="1"/>
+            </wp:cNvGraphicFramePr>
+            <a:graphic xmlns:a="http://schemas.openxmlformats.org/drawingml/2006/main">
+              <a:graphicData uri="http://schemas.openxmlformats.org/drawingml/2006/picture">
+                <pic:pic xmlns:pic="http://schemas.openxmlformats.org/drawingml/2006/picture">
+                  <pic:nvPicPr>
+                    <pic:cNvPr id="133078614" name=""/>
+                    <pic:cNvPicPr/>
+                  </pic:nvPicPr>
+                  <pic:blipFill>
+                    <a:blip r:embed="rId29"/>
+                    <a:stretch>
+                      <a:fillRect/>
+                    </a:stretch>
+                  </pic:blipFill>
+                  <pic:spPr>
+                    <a:xfrm>
+                      <a:off x="0" y="0"/>
+                      <a:ext cx="5972810" cy="2179955"/>
+                    </a:xfrm>
+                    <a:prstGeom prst="rect">
+                      <a:avLst/>
+                    </a:prstGeom>
+                  </pic:spPr>
+                </pic:pic>
+              </a:graphicData>
+            </a:graphic>
+          </wp:inline>
+        </w:drawing>
+      </w:r>
+    </w:p>
     <w:p/>
     <w:p/>
     <w:p/>

</xml_diff>